<commit_message>
resume(.docx): add clickable project links — HRMS/ALIA case studies, Samba live, repos
Co-Authored-By: Claude Fable 5 <noreply@anthropic.com>
</commit_message>
<xml_diff>
--- a/public/Jyothi_Swaroop_S_Resume.docx
+++ b/public/Jyothi_Swaroop_S_Resume.docx
@@ -454,7 +454,7 @@
     <w:p>
       <w:pPr>
         <w:pStyle w:val="ListBullet"/>
-        <w:spacing w:after="40" w:line="252" w:lineRule="auto"/>
+        <w:spacing w:after="60" w:line="252" w:lineRule="auto"/>
         <w:ind w:left="288"/>
       </w:pPr>
       <w:r>
@@ -462,13 +462,23 @@
           <w:color w:val="1A1A1A"/>
           <w:sz w:val="20"/>
         </w:rPr>
-        <w:t>WebQ — Autonomous AI Marketing Agency (client build, in progress): 34 agents across 11 teams with a human approval gate and per-client brand memory. Python, FastAPI.</w:t>
+        <w:t xml:space="preserve">HRMS Platform (production · live — 3 orgs, 80+ users) — multi-tenant HR system: Django + Next.js, biometric attendance, payroll, 794-test suite. Case study:  </w:t>
       </w:r>
+      <w:hyperlink r:id="rId9">
+        <w:r>
+          <w:rPr>
+            <w:color w:val="1D4ED8"/>
+            <w:u w:val="single"/>
+            <w:sz w:val="20"/>
+          </w:rPr>
+          <w:t>swaroopos.vercel.app/projects/hrms</w:t>
+        </w:r>
+      </w:hyperlink>
     </w:p>
     <w:p>
       <w:pPr>
         <w:pStyle w:val="ListBullet"/>
-        <w:spacing w:after="40" w:line="252" w:lineRule="auto"/>
+        <w:spacing w:after="60" w:line="252" w:lineRule="auto"/>
         <w:ind w:left="288"/>
       </w:pPr>
       <w:r>
@@ -476,13 +486,23 @@
           <w:color w:val="1A1A1A"/>
           <w:sz w:val="20"/>
         </w:rPr>
-        <w:t>ADVAIT — Autonomous AI Software Company (source-available prototype): 35 agents turn a one-line brief into contract-locked, build-verified, browser-tested code. Python, FastAPI, Playwright.</w:t>
+        <w:t xml:space="preserve">ALIA — AI Teaching Assistant (production · UAE edtech LMS) — self-hosted RAG with cited sources and an anti-hallucination confidence gate, on AWS EC2. Case study:  </w:t>
       </w:r>
+      <w:hyperlink r:id="rId10">
+        <w:r>
+          <w:rPr>
+            <w:color w:val="1D4ED8"/>
+            <w:u w:val="single"/>
+            <w:sz w:val="20"/>
+          </w:rPr>
+          <w:t>swaroopos.vercel.app/projects/alia</w:t>
+        </w:r>
+      </w:hyperlink>
     </w:p>
     <w:p>
       <w:pPr>
         <w:pStyle w:val="ListBullet"/>
-        <w:spacing w:after="40" w:line="252" w:lineRule="auto"/>
+        <w:spacing w:after="60" w:line="252" w:lineRule="auto"/>
         <w:ind w:left="288"/>
       </w:pPr>
       <w:r>
@@ -490,13 +510,23 @@
           <w:color w:val="1A1A1A"/>
           <w:sz w:val="20"/>
         </w:rPr>
-        <w:t>Bank Statement Analyzer: converts Excel bank statements into Tally double-entry vouchers via hybrid LLM + deterministic classification, with a grounded finance chatbot. React, Express, GPT-4o.</w:t>
+        <w:t xml:space="preserve">Samba Retail (freelance · live) — client retail site built and deployed solo: Next.js 15, Sanity CMS, Vercel. Live:  </w:t>
       </w:r>
+      <w:hyperlink r:id="rId11">
+        <w:r>
+          <w:rPr>
+            <w:color w:val="1D4ED8"/>
+            <w:u w:val="single"/>
+            <w:sz w:val="20"/>
+          </w:rPr>
+          <w:t>samba-retail-web.vercel.app</w:t>
+        </w:r>
+      </w:hyperlink>
     </w:p>
     <w:p>
       <w:pPr>
         <w:pStyle w:val="ListBullet"/>
-        <w:spacing w:after="40" w:line="252" w:lineRule="auto"/>
+        <w:spacing w:after="60" w:line="252" w:lineRule="auto"/>
         <w:ind w:left="288"/>
       </w:pPr>
       <w:r>
@@ -504,13 +534,23 @@
           <w:color w:val="1A1A1A"/>
           <w:sz w:val="20"/>
         </w:rPr>
-        <w:t>Sahara Sense (prototype): UAE dust-storm forecasting — 9-API sensor fusion, statistical ensemble + Kalman filtering, live WebSocket dashboard. Next.js, FastAPI.</w:t>
+        <w:t xml:space="preserve">WebQ — Autonomous AI Marketing Agency (client build, in progress) — 34 agents across 11 teams with a human approval gate and per-client brand memory. Python, FastAPI. Code:  </w:t>
       </w:r>
+      <w:hyperlink r:id="rId12">
+        <w:r>
+          <w:rPr>
+            <w:color w:val="1D4ED8"/>
+            <w:u w:val="single"/>
+            <w:sz w:val="20"/>
+          </w:rPr>
+          <w:t>github.com/sumith1309/WEBQ-</w:t>
+        </w:r>
+      </w:hyperlink>
     </w:p>
     <w:p>
       <w:pPr>
         <w:pStyle w:val="ListBullet"/>
-        <w:spacing w:after="40" w:line="252" w:lineRule="auto"/>
+        <w:spacing w:after="60" w:line="252" w:lineRule="auto"/>
         <w:ind w:left="288"/>
       </w:pPr>
       <w:r>
@@ -518,8 +558,66 @@
           <w:color w:val="1A1A1A"/>
           <w:sz w:val="20"/>
         </w:rPr>
-        <w:t>Samba Retail: client retail site built and deployed solo — Next.js 15, Sanity CMS, Vercel. Live.</w:t>
+        <w:t xml:space="preserve">ADVAIT — Autonomous AI Software Company (source-available prototype) — 35 agents turn a brief into contract-locked, build-verified, browser-tested code. Python, FastAPI, Playwright. Code:  </w:t>
       </w:r>
+      <w:hyperlink r:id="rId13">
+        <w:r>
+          <w:rPr>
+            <w:color w:val="1D4ED8"/>
+            <w:u w:val="single"/>
+            <w:sz w:val="20"/>
+          </w:rPr>
+          <w:t>github.com/sumith1309/ADVAIT.io</w:t>
+        </w:r>
+      </w:hyperlink>
+    </w:p>
+    <w:p>
+      <w:pPr>
+        <w:pStyle w:val="ListBullet"/>
+        <w:spacing w:after="60" w:line="252" w:lineRule="auto"/>
+        <w:ind w:left="288"/>
+      </w:pPr>
+      <w:r>
+        <w:rPr>
+          <w:color w:val="1A1A1A"/>
+          <w:sz w:val="20"/>
+        </w:rPr>
+        <w:t xml:space="preserve">Bank Statement Analyzer — Excel bank statements to Tally double-entry vouchers via hybrid LLM + deterministic classification, with a grounded finance chatbot. React, Express, GPT-4o. Code:  </w:t>
+      </w:r>
+      <w:hyperlink r:id="rId14">
+        <w:r>
+          <w:rPr>
+            <w:color w:val="1D4ED8"/>
+            <w:u w:val="single"/>
+            <w:sz w:val="20"/>
+          </w:rPr>
+          <w:t>github.com/sumith1309/Bank-Statement-Analyzer</w:t>
+        </w:r>
+      </w:hyperlink>
+    </w:p>
+    <w:p>
+      <w:pPr>
+        <w:pStyle w:val="ListBullet"/>
+        <w:spacing w:after="60" w:line="252" w:lineRule="auto"/>
+        <w:ind w:left="288"/>
+      </w:pPr>
+      <w:r>
+        <w:rPr>
+          <w:color w:val="1A1A1A"/>
+          <w:sz w:val="20"/>
+        </w:rPr>
+        <w:t xml:space="preserve">Sahara Sense (prototype) — UAE dust-storm forecasting: 9-API sensor fusion, statistical ensemble + Kalman filtering, live WebSocket dashboard. Next.js, FastAPI. Code:  </w:t>
+      </w:r>
+      <w:hyperlink r:id="rId15">
+        <w:r>
+          <w:rPr>
+            <w:color w:val="1D4ED8"/>
+            <w:u w:val="single"/>
+            <w:sz w:val="20"/>
+          </w:rPr>
+          <w:t>github.com/sumith1309/Project_Sahara_Sense</w:t>
+        </w:r>
+      </w:hyperlink>
     </w:p>
     <w:p>
       <w:pPr>

</xml_diff>

<commit_message>
resume(.docx): AI Solution Engineer / GenAI primary version — repositioned headline, honest RAG keywords, softened claims
Co-Authored-By: Claude Fable 5 <noreply@anthropic.com>
</commit_message>
<xml_diff>
--- a/public/Jyothi_Swaroop_S_Resume.docx
+++ b/public/Jyothi_Swaroop_S_Resume.docx
@@ -29,7 +29,7 @@
           <w:color w:val="444A54"/>
           <w:sz w:val="22"/>
         </w:rPr>
-        <w:t>AI Engineer &amp; AI Product Builder  |  Production LLM/RAG Systems · Full-Stack Delivery</w:t>
+        <w:t>AI Solution Engineer  |  GenAI / RAG Developer  |  AI Product Delivery</w:t>
       </w:r>
     </w:p>
     <w:p>
@@ -44,7 +44,7 @@
           <w:color w:val="1A1A1A"/>
           <w:sz w:val="19"/>
         </w:rPr>
-        <w:t>Dubai, UAE  ·  sumithswaroop@gmail.com  ·  +91 94900 64789</w:t>
+        <w:t>Dubai, UAE  ·  sumithswaroop@gmail.com  ·  +91 94900 64789 (WhatsApp)</w:t>
       </w:r>
     </w:p>
     <w:p>
@@ -86,7 +86,6 @@
       </w:pPr>
       <w:r>
         <w:rPr>
-          <w:rFonts w:ascii="Calibri" w:hAnsi="Calibri"/>
           <w:b/>
           <w:color w:val="0F234A"/>
           <w:sz w:val="22"/>
@@ -105,7 +104,7 @@
           <w:color w:val="1A1A1A"/>
           <w:sz w:val="20"/>
         </w:rPr>
-        <w:t>AI engineer in Dubai who scopes, builds, and ships production AI systems end-to-end. Primary developer of a multi-tenant HRMS live for 3 UAE organizations and 80+ employees (794-test backend, no production defects since launch), and sole builder of ALIA — a self-hosted RAG teaching assistant with cited sources and an anti-hallucination confidence gate. Combines a Master's in AI in Business (SP Jain, Dubai) with 5 years of operations leadership to turn ambiguous business problems into LLM, RAG, and automation solutions with measurable impact.</w:t>
+        <w:t>AI Solution Engineer and GenAI developer in Dubai who turns business workflows into deployed AI systems — scoping requirements, building the solution, integrating it, and shipping. As primary developer, built and shipped a live multi-tenant HRMS used by 3 UAE organizations and 80+ employees, with ZKTeco biometric integration, enterprise SSO, and a 794-test backend. Built ALIA end-to-end — a self-hosted RAG assistant (LangChain, pgvector, AWS EC2) with embeddings, re-ranking, cited answers, and human escalation for low-confidence queries. Backed by a Master's in AI in Business (SP Jain, Dubai) and 5 years of operations experience.</w:t>
       </w:r>
     </w:p>
     <w:p>
@@ -117,7 +116,6 @@
       </w:pPr>
       <w:r>
         <w:rPr>
-          <w:rFonts w:ascii="Calibri" w:hAnsi="Calibri"/>
           <w:b/>
           <w:color w:val="0F234A"/>
           <w:sz w:val="22"/>
@@ -135,14 +133,14 @@
           <w:color w:val="0F234A"/>
           <w:sz w:val="20"/>
         </w:rPr>
-        <w:t xml:space="preserve">AI &amp; LLM: </w:t>
+        <w:t xml:space="preserve">AI &amp; GenAI: </w:t>
       </w:r>
       <w:r>
         <w:rPr>
           <w:color w:val="1A1A1A"/>
           <w:sz w:val="20"/>
         </w:rPr>
-        <w:t>RAG pipelines (pgvector), AI agents &amp; multi-turn tool-calling, OpenAI · Anthropic Claude · Gemini · Ollama, prompt engineering, model evaluation; applied ML (XGBoost, ensembles)</w:t>
+        <w:t>RAG pipelines, LangChain, pgvector, embeddings, chunking, vector search, re-ranking, retrieval evaluation, guardrails, human-in-the-loop escalation, prompt engineering, AI agents &amp; multi-turn tool-calling, LLM evaluation, OpenAI · Anthropic Claude · Gemini · Ollama; applied ML (XGBoost, ensembles)</w:t>
       </w:r>
     </w:p>
     <w:p>
@@ -155,14 +153,14 @@
           <w:color w:val="0F234A"/>
           <w:sz w:val="20"/>
         </w:rPr>
-        <w:t xml:space="preserve">Engineering: </w:t>
+        <w:t xml:space="preserve">Backend &amp; Full-Stack: </w:t>
       </w:r>
       <w:r>
         <w:rPr>
           <w:color w:val="1A1A1A"/>
           <w:sz w:val="20"/>
         </w:rPr>
-        <w:t>Python, TypeScript, Django, FastAPI, React/Next.js, PostgreSQL, Redis, REST APIs, multi-tenant SaaS, OAuth 2.0/OIDC &amp; SSO (Microsoft Entra ID, Google), AWS (EC2, S3), Docker, CI/CD, pytest/vitest, application security (SQLi, IDOR, CSRF, XSS)</w:t>
+        <w:t>Python, TypeScript, Django, FastAPI, React/Next.js, PostgreSQL, Redis, REST APIs, multi-tenant SaaS, pytest, vitest</w:t>
       </w:r>
     </w:p>
     <w:p>
@@ -175,14 +173,74 @@
           <w:color w:val="0F234A"/>
           <w:sz w:val="20"/>
         </w:rPr>
-        <w:t xml:space="preserve">Product &amp; Delivery: </w:t>
+        <w:t xml:space="preserve">Cloud &amp; Deployment: </w:t>
       </w:r>
       <w:r>
         <w:rPr>
           <w:color w:val="1A1A1A"/>
           <w:sz w:val="20"/>
         </w:rPr>
-        <w:t>Product strategy, PRD/TRD, roadmapping, feature prioritization, Agile/JIRA, stakeholder management, acceptance criteria, POC/MVP to production, ROI analysis</w:t>
+        <w:t>AWS EC2, AWS S3, Docker, CI/CD, Vercel</w:t>
+      </w:r>
+    </w:p>
+    <w:p>
+      <w:pPr>
+        <w:spacing w:after="40" w:line="252" w:lineRule="auto"/>
+      </w:pPr>
+      <w:r>
+        <w:rPr>
+          <w:b/>
+          <w:color w:val="0F234A"/>
+          <w:sz w:val="20"/>
+        </w:rPr>
+        <w:t xml:space="preserve">Enterprise Integration: </w:t>
+      </w:r>
+      <w:r>
+        <w:rPr>
+          <w:color w:val="1A1A1A"/>
+          <w:sz w:val="20"/>
+        </w:rPr>
+        <w:t>OAuth 2.0 / OIDC, Microsoft Entra ID, Google SSO, ZKTeco BioTime biometrics, LMS integration, API integration</w:t>
+      </w:r>
+    </w:p>
+    <w:p>
+      <w:pPr>
+        <w:spacing w:after="40" w:line="252" w:lineRule="auto"/>
+      </w:pPr>
+      <w:r>
+        <w:rPr>
+          <w:b/>
+          <w:color w:val="0F234A"/>
+          <w:sz w:val="20"/>
+        </w:rPr>
+        <w:t xml:space="preserve">Solution &amp; Product Delivery: </w:t>
+      </w:r>
+      <w:r>
+        <w:rPr>
+          <w:color w:val="1A1A1A"/>
+          <w:sz w:val="20"/>
+        </w:rPr>
+        <w:t>Technical discovery, requirements gathering, solution design, PRD/TRD, acceptance criteria, POC/MVP delivery, UAT, roadmap, feature prioritization, stakeholder management, Agile/JIRA, ROI analysis</w:t>
+      </w:r>
+    </w:p>
+    <w:p>
+      <w:pPr>
+        <w:spacing w:after="40" w:line="252" w:lineRule="auto"/>
+      </w:pPr>
+      <w:r>
+        <w:rPr>
+          <w:b/>
+          <w:color w:val="0F234A"/>
+          <w:sz w:val="20"/>
+        </w:rPr>
+        <w:t xml:space="preserve">Security: </w:t>
+      </w:r>
+      <w:r>
+        <w:rPr>
+          <w:color w:val="1A1A1A"/>
+          <w:sz w:val="20"/>
+        </w:rPr>
+        <w:t>SQL injection, IDOR, CSRF, XSS mitigation, authentication flows</w:t>
       </w:r>
     </w:p>
     <w:p>
@@ -194,7 +252,6 @@
       </w:pPr>
       <w:r>
         <w:rPr>
-          <w:rFonts w:ascii="Calibri" w:hAnsi="Calibri"/>
           <w:b/>
           <w:color w:val="0F234A"/>
           <w:sz w:val="22"/>
@@ -239,7 +296,7 @@
           <w:color w:val="1A1A1A"/>
           <w:sz w:val="20"/>
         </w:rPr>
-        <w:t>Shipped a production multi-tenant HRMS as primary developer — live for 3 UAE organizations and 80+ employees across 12 modules (attendance, leave, payroll, recruitment, helpdesk).</w:t>
+        <w:t>Built and shipped key modules of a live multi-tenant HRMS as primary developer (Django, Next.js, PostgreSQL, REST APIs) for 3 UAE organizations and 80+ employees — attendance, leave, payroll, recruitment, helpdesk.</w:t>
       </w:r>
     </w:p>
     <w:p>
@@ -253,7 +310,7 @@
           <w:color w:val="1A1A1A"/>
           <w:sz w:val="20"/>
         </w:rPr>
-        <w:t>Integrated ZKTeco BioTime biometric attendance for 64+ field staff with idempotent sync and automated attendance calculation.</w:t>
+        <w:t>Integrated ZKTeco BioTime biometric attendance for 64+ field staff with idempotent sync and automated attendance calculation, reducing manual reconciliation.</w:t>
       </w:r>
     </w:p>
     <w:p>
@@ -267,7 +324,7 @@
           <w:color w:val="1A1A1A"/>
           <w:sz w:val="20"/>
         </w:rPr>
-        <w:t>Owned requirements, acceptance criteria, and QA sign-off; shipped a 794-test backend suite with no production defects reported since launch.</w:t>
+        <w:t>Translated stakeholder requirements into acceptance criteria and QA sign-off; contributed to a 794-test backend suite with no reported critical production defects to date.</w:t>
       </w:r>
     </w:p>
     <w:p>
@@ -281,7 +338,7 @@
           <w:color w:val="1A1A1A"/>
           <w:sz w:val="20"/>
         </w:rPr>
-        <w:t>Built ALIA end-to-end — a RAG teaching assistant (LangChain + pgvector, self-hosted on AWS EC2) with cited sources and a confidence gate that escalates to a human instead of hallucinating.</w:t>
+        <w:t>Built ALIA end-to-end — a self-hosted RAG assistant (LangChain, pgvector, AWS EC2) with embeddings and re-ranking, cited answers, and human escalation for low-confidence queries to reduce hallucination.</w:t>
       </w:r>
     </w:p>
     <w:p>
@@ -295,7 +352,7 @@
           <w:color w:val="1A1A1A"/>
           <w:sz w:val="20"/>
         </w:rPr>
-        <w:t>Contributed to enterprise SSO (Microsoft Entra ID + Google OIDC) and an AI support-ticket triage system within the team's LMS.</w:t>
+        <w:t>Contributed to Microsoft Entra ID + Google OIDC SSO and an AI support-ticket triage system within the team's LMS.</w:t>
       </w:r>
     </w:p>
     <w:p>
@@ -335,7 +392,7 @@
           <w:color w:val="1A1A1A"/>
           <w:sz w:val="20"/>
         </w:rPr>
-        <w:t>Led a cross-functional team building an AI mock-interview and roleplay tool now in active use by SP Jain students across courses and batches.</w:t>
+        <w:t>Delivered an AI mock-interview and roleplay tool now in active use by SP Jain students across courses and batches, leading a cross-functional team.</w:t>
       </w:r>
     </w:p>
     <w:p>
@@ -349,7 +406,7 @@
           <w:color w:val="1A1A1A"/>
           <w:sz w:val="20"/>
         </w:rPr>
-        <w:t>Owned the product roadmap, MVP scope, and feature prioritization; coordinated HeyGen AI avatars, WebRTC recording, and a live-feedback analytics dashboard.</w:t>
+        <w:t>Owned roadmap, MVP scope, and feature prioritization; coordinated HeyGen AI avatars, WebRTC recording, and a live-feedback analytics dashboard.</w:t>
       </w:r>
     </w:p>
     <w:p>
@@ -363,7 +420,7 @@
           <w:color w:val="1A1A1A"/>
           <w:sz w:val="20"/>
         </w:rPr>
-        <w:t>Certificate of Appreciation, VP Administration.</w:t>
+        <w:t>Recognized with a Certificate of Appreciation from the VP, Administration, for delivery and coordination.</w:t>
       </w:r>
     </w:p>
     <w:p>
@@ -376,7 +433,7 @@
           <w:color w:val="0F234A"/>
           <w:sz w:val="21"/>
         </w:rPr>
-        <w:t>Partner &amp; Operations Manager — Geetha Constructions (family business), Hyderabad, India</w:t>
+        <w:t>Partner &amp; Operations Manager — Geetha Constructions, Hyderabad, India</w:t>
       </w:r>
     </w:p>
     <w:p>
@@ -403,7 +460,7 @@
           <w:color w:val="1A1A1A"/>
           <w:sz w:val="20"/>
         </w:rPr>
-        <w:t>Ran operations for a family construction business for 5 years; cut operational delays ~30% with data-driven workflows and streamlined procurement.</w:t>
+        <w:t>Ran operations for a construction business for 5 years; reduced project delays ~30% (internal tracking) through data-driven workflows and procurement coordination.</w:t>
       </w:r>
     </w:p>
     <w:p>
@@ -417,7 +474,7 @@
           <w:color w:val="1A1A1A"/>
           <w:sz w:val="20"/>
         </w:rPr>
-        <w:t>Owned vendor management, resource planning, and site execution under real budget and deadline pressure.</w:t>
+        <w:t>Managed vendors, resource planning, and site execution under budget and deadline constraints.</w:t>
       </w:r>
     </w:p>
     <w:p>
@@ -431,7 +488,7 @@
           <w:color w:val="1A1A1A"/>
           <w:sz w:val="20"/>
         </w:rPr>
-        <w:t>Built the company's first software tool — a SaaS construction cost-estimation app with payments — replacing manual quoting.</w:t>
+        <w:t>Built the company's first SaaS-style construction cost-estimation tool with payments, replacing manual quoting.</w:t>
       </w:r>
     </w:p>
     <w:p>
@@ -443,7 +500,6 @@
       </w:pPr>
       <w:r>
         <w:rPr>
-          <w:rFonts w:ascii="Calibri" w:hAnsi="Calibri"/>
           <w:b/>
           <w:color w:val="0F234A"/>
           <w:sz w:val="22"/>
@@ -486,7 +542,7 @@
           <w:color w:val="1A1A1A"/>
           <w:sz w:val="20"/>
         </w:rPr>
-        <w:t xml:space="preserve">ALIA — AI Teaching Assistant (production · UAE edtech LMS) — self-hosted RAG with cited sources and an anti-hallucination confidence gate, on AWS EC2. Case study:  </w:t>
+        <w:t xml:space="preserve">ALIA — RAG Teaching Assistant (production · UAE edtech LMS) — self-hosted RAG (LangChain, pgvector, AWS EC2) with embeddings, re-ranking, cited answers, and human escalation. Case study:  </w:t>
       </w:r>
       <w:hyperlink r:id="rId10">
         <w:r>
@@ -502,6 +558,20 @@
     <w:p>
       <w:pPr>
         <w:pStyle w:val="ListBullet"/>
+        <w:spacing w:after="40" w:line="252" w:lineRule="auto"/>
+        <w:ind w:left="288"/>
+      </w:pPr>
+      <w:r>
+        <w:rPr>
+          <w:color w:val="1A1A1A"/>
+          <w:sz w:val="20"/>
+        </w:rPr>
+        <w:t>AI Mock-Interview &amp; Roleplay Tool (in active use · SP Jain) — HeyGen AI avatars, WebRTC recording, and feedback analytics; led product delivery across courses and batches.</w:t>
+      </w:r>
+    </w:p>
+    <w:p>
+      <w:pPr>
+        <w:pStyle w:val="ListBullet"/>
         <w:spacing w:after="60" w:line="252" w:lineRule="auto"/>
         <w:ind w:left="288"/>
       </w:pPr>
@@ -510,7 +580,7 @@
           <w:color w:val="1A1A1A"/>
           <w:sz w:val="20"/>
         </w:rPr>
-        <w:t xml:space="preserve">Samba Retail (freelance · live) — client retail site built and deployed solo: Next.js 15, Sanity CMS, Vercel. Live:  </w:t>
+        <w:t xml:space="preserve">Bank Statement Analyzer — Excel bank statements to Tally double-entry vouchers via hybrid LLM + deterministic classification, with a grounded finance chatbot. React, Express, GPT-4o. Code:  </w:t>
       </w:r>
       <w:hyperlink r:id="rId11">
         <w:r>
@@ -519,7 +589,7 @@
             <w:u w:val="single"/>
             <w:sz w:val="20"/>
           </w:rPr>
-          <w:t>samba-retail-web.vercel.app</w:t>
+          <w:t>github.com/sumith1309/Bank-Statement-Analyzer</w:t>
         </w:r>
       </w:hyperlink>
     </w:p>
@@ -534,7 +604,7 @@
           <w:color w:val="1A1A1A"/>
           <w:sz w:val="20"/>
         </w:rPr>
-        <w:t xml:space="preserve">WebQ — Autonomous AI Marketing Agency (client build, in progress) — 34 agents across 11 teams with a human approval gate and per-client brand memory. Python, FastAPI. Code:  </w:t>
+        <w:t xml:space="preserve">Sahara Sense (prototype) — UAE dust-storm forecasting: 9-API sensor fusion, statistical ensemble + Kalman filtering, live WebSocket dashboard. Next.js, FastAPI. Code:  </w:t>
       </w:r>
       <w:hyperlink r:id="rId12">
         <w:r>
@@ -543,7 +613,7 @@
             <w:u w:val="single"/>
             <w:sz w:val="20"/>
           </w:rPr>
-          <w:t>github.com/sumith1309/WEBQ-</w:t>
+          <w:t>github.com/sumith1309/Project_Sahara_Sense</w:t>
         </w:r>
       </w:hyperlink>
     </w:p>
@@ -558,7 +628,7 @@
           <w:color w:val="1A1A1A"/>
           <w:sz w:val="20"/>
         </w:rPr>
-        <w:t xml:space="preserve">ADVAIT — Autonomous AI Software Company (source-available prototype) — 35 agents turn a brief into contract-locked, build-verified, browser-tested code. Python, FastAPI, Playwright. Code:  </w:t>
+        <w:t xml:space="preserve">ADVAIT — agentic software-generation prototype (source-available) — converts a brief into contract-locked, build-verified, browser-tested code. Python, FastAPI, Playwright. Code:  </w:t>
       </w:r>
       <w:hyperlink r:id="rId13">
         <w:r>
@@ -582,7 +652,7 @@
           <w:color w:val="1A1A1A"/>
           <w:sz w:val="20"/>
         </w:rPr>
-        <w:t xml:space="preserve">Bank Statement Analyzer — Excel bank statements to Tally double-entry vouchers via hybrid LLM + deterministic classification, with a grounded finance chatbot. React, Express, GPT-4o. Code:  </w:t>
+        <w:t xml:space="preserve">Also: WebQ — multi-agent marketing workflow prototype (client build, Python/FastAPI, human approval gates)  </w:t>
       </w:r>
       <w:hyperlink r:id="rId14">
         <w:r>
@@ -591,22 +661,15 @@
             <w:u w:val="single"/>
             <w:sz w:val="20"/>
           </w:rPr>
-          <w:t>github.com/sumith1309/Bank-Statement-Analyzer</w:t>
+          <w:t>github.com/sumith1309/WEBQ-</w:t>
         </w:r>
       </w:hyperlink>
-    </w:p>
-    <w:p>
-      <w:pPr>
-        <w:pStyle w:val="ListBullet"/>
-        <w:spacing w:after="60" w:line="252" w:lineRule="auto"/>
-        <w:ind w:left="288"/>
-      </w:pPr>
       <w:r>
         <w:rPr>
           <w:color w:val="1A1A1A"/>
           <w:sz w:val="20"/>
         </w:rPr>
-        <w:t xml:space="preserve">Sahara Sense (prototype) — UAE dust-storm forecasting: 9-API sensor fusion, statistical ensemble + Kalman filtering, live WebSocket dashboard. Next.js, FastAPI. Code:  </w:t>
+        <w:t xml:space="preserve">  ·  Samba Retail — live freelance retail site (Next.js, Sanity CMS, Vercel)  </w:t>
       </w:r>
       <w:hyperlink r:id="rId15">
         <w:r>
@@ -615,7 +678,7 @@
             <w:u w:val="single"/>
             <w:sz w:val="20"/>
           </w:rPr>
-          <w:t>github.com/sumith1309/Project_Sahara_Sense</w:t>
+          <w:t>samba-retail-web.vercel.app</w:t>
         </w:r>
       </w:hyperlink>
     </w:p>
@@ -628,7 +691,6 @@
       </w:pPr>
       <w:r>
         <w:rPr>
-          <w:rFonts w:ascii="Calibri" w:hAnsi="Calibri"/>
           <w:b/>
           <w:color w:val="0F234A"/>
           <w:sz w:val="22"/>
@@ -701,7 +763,6 @@
       </w:pPr>
       <w:r>
         <w:rPr>
-          <w:rFonts w:ascii="Calibri" w:hAnsi="Calibri"/>
           <w:b/>
           <w:color w:val="0F234A"/>
           <w:sz w:val="22"/>
@@ -720,7 +781,7 @@
           <w:color w:val="1A1A1A"/>
           <w:sz w:val="20"/>
         </w:rPr>
-        <w:t>Claude Code in Action (Anthropic, 2026)  ·  Python Programming  ·  Microsoft Office Specialist — Advanced  ·  MySQL Database Fundamentals (Oracle)  ·  JIRA Administration (Atlassian)</w:t>
+        <w:t>Claude Code in Action (Anthropic, 2026)  ·  Python Programming  ·  JIRA Administration (Atlassian)  ·  MySQL Database Fundamentals (Oracle)  ·  Microsoft Office Specialist — Advanced</w:t>
       </w:r>
     </w:p>
     <w:p>
@@ -732,7 +793,6 @@
       </w:pPr>
       <w:r>
         <w:rPr>
-          <w:rFonts w:ascii="Calibri" w:hAnsi="Calibri"/>
           <w:b/>
           <w:color w:val="0F234A"/>
           <w:sz w:val="22"/>
@@ -751,7 +811,7 @@
           <w:color w:val="1A1A1A"/>
           <w:sz w:val="20"/>
         </w:rPr>
-        <w:t>Nationality: Indian  ·  Languages: English (Professional), Hindi, Telugu  ·  UAE resident (student visa); open to employment-visa sponsorship</w:t>
+        <w:t>Languages: English (Professional), Hindi, Telugu  ·  Nationality: Indian  ·  UAE resident (student visa); open to employment-visa sponsorship</w:t>
       </w:r>
     </w:p>
     <w:sectPr>

</xml_diff>

<commit_message>
resume(.docx): tighten SE version — grounded summary, cut unproven claim, ALIA 'deployed', 5 core projects
Co-Authored-By: Claude Fable 5 <noreply@anthropic.com>
</commit_message>
<xml_diff>
--- a/public/Jyothi_Swaroop_S_Resume.docx
+++ b/public/Jyothi_Swaroop_S_Resume.docx
@@ -104,7 +104,7 @@
           <w:color w:val="1A1A1A"/>
           <w:sz w:val="20"/>
         </w:rPr>
-        <w:t>AI Solution Engineer and GenAI developer in Dubai who turns business workflows into deployed AI systems — scoping requirements, building the solution, integrating it, and shipping. As primary developer, built and shipped a live multi-tenant HRMS used by 3 UAE organizations and 80+ employees, with ZKTeco biometric integration, enterprise SSO, and a 794-test backend. Built ALIA end-to-end — a self-hosted RAG assistant (LangChain, pgvector, AWS EC2) with embeddings, re-ranking, cited answers, and human escalation for low-confidence queries. Backed by a Master's in AI in Business (SP Jain, Dubai) and 5 years of operations experience.</w:t>
+        <w:t>AI developer and GenAI/RAG builder in Dubai, focused on turning business workflows into practical AI systems — scoping requirements, building the solution, integrating it, and shipping. As primary developer, built and shipped key modules of a live multi-tenant HRMS used by 3 UAE organizations and 80+ employees, with ZKTeco biometric integration, enterprise SSO contribution, and a 794-test backend. Built ALIA end-to-end — a self-hosted RAG assistant (LangChain, pgvector, AWS EC2) with cited answers and human escalation for low-confidence queries. Backed by a Master's in AI in Business (SP Jain, Dubai) and 5 years of prior operations experience.</w:t>
       </w:r>
     </w:p>
     <w:p>
@@ -140,7 +140,7 @@
           <w:color w:val="1A1A1A"/>
           <w:sz w:val="20"/>
         </w:rPr>
-        <w:t>RAG pipelines, LangChain, pgvector, embeddings, chunking, vector search, re-ranking, retrieval evaluation, guardrails, human-in-the-loop escalation, prompt engineering, AI agents &amp; multi-turn tool-calling, LLM evaluation, OpenAI · Anthropic Claude · Gemini · Ollama; applied ML (XGBoost, ensembles)</w:t>
+        <w:t>RAG pipelines, LangChain, pgvector, embeddings, chunking, vector search, re-ranking, guardrails, human-in-the-loop escalation, prompt engineering, AI agents &amp; multi-turn tool-calling, LLM evaluation, OpenAI · Anthropic Claude · Gemini · Ollama; applied ML (XGBoost, ensembles)</w:t>
       </w:r>
     </w:p>
     <w:p>
@@ -542,7 +542,7 @@
           <w:color w:val="1A1A1A"/>
           <w:sz w:val="20"/>
         </w:rPr>
-        <w:t xml:space="preserve">ALIA — RAG Teaching Assistant (production · UAE edtech LMS) — self-hosted RAG (LangChain, pgvector, AWS EC2) with embeddings, re-ranking, cited answers, and human escalation. Case study:  </w:t>
+        <w:t xml:space="preserve">ALIA — RAG Teaching Assistant (deployed · UAE edtech LMS) — self-hosted RAG (LangChain, pgvector, AWS EC2) with embeddings, re-ranking, cited answers, and human escalation. Case study:  </w:t>
       </w:r>
       <w:hyperlink r:id="rId10">
         <w:r>
@@ -628,7 +628,7 @@
           <w:color w:val="1A1A1A"/>
           <w:sz w:val="20"/>
         </w:rPr>
-        <w:t xml:space="preserve">ADVAIT — agentic software-generation prototype (source-available) — converts a brief into contract-locked, build-verified, browser-tested code. Python, FastAPI, Playwright. Code:  </w:t>
+        <w:t xml:space="preserve">Additional (source-available prototypes / freelance): ADVAIT — agentic software-generation prototype  </w:t>
       </w:r>
       <w:hyperlink r:id="rId13">
         <w:r>
@@ -640,19 +640,12 @@
           <w:t>github.com/sumith1309/ADVAIT.io</w:t>
         </w:r>
       </w:hyperlink>
-    </w:p>
-    <w:p>
-      <w:pPr>
-        <w:pStyle w:val="ListBullet"/>
-        <w:spacing w:after="60" w:line="252" w:lineRule="auto"/>
-        <w:ind w:left="288"/>
-      </w:pPr>
       <w:r>
         <w:rPr>
           <w:color w:val="1A1A1A"/>
           <w:sz w:val="20"/>
         </w:rPr>
-        <w:t xml:space="preserve">Also: WebQ — multi-agent marketing workflow prototype (client build, Python/FastAPI, human approval gates)  </w:t>
+        <w:t xml:space="preserve">  ·  WebQ — multi-agent marketing workflow prototype  </w:t>
       </w:r>
       <w:hyperlink r:id="rId14">
         <w:r>
@@ -669,7 +662,7 @@
           <w:color w:val="1A1A1A"/>
           <w:sz w:val="20"/>
         </w:rPr>
-        <w:t xml:space="preserve">  ·  Samba Retail — live freelance retail site (Next.js, Sanity CMS, Vercel)  </w:t>
+        <w:t xml:space="preserve">  ·  Samba Retail — freelance retail site  </w:t>
       </w:r>
       <w:hyperlink r:id="rId15">
         <w:r>

</xml_diff>